<commit_message>
Update Power Apps class notes.docx
</commit_message>
<xml_diff>
--- a/3-power-apps/Power Apps class notes.docx
+++ b/3-power-apps/Power Apps class notes.docx
@@ -411,12 +411,6 @@
         <w:gridCol w:w="9747"/>
       </w:tblGrid>
       <w:tr>
-        <w:tblPrEx>
-          <w:tblCellMar>
-            <w:top w:w="0" w:type="dxa"/>
-            <w:bottom w:w="0" w:type="dxa"/>
-          </w:tblCellMar>
-        </w:tblPrEx>
         <w:tc>
           <w:tcPr>
             <w:tcW w:w="300" w:type="dxa"/>
@@ -488,7 +482,32 @@
         <w:spacing w:before="60"/>
       </w:pPr>
       <w:r>
-        <w:t xml:space="preserve">If this happens Power Apps ID will need to be added manually. Can automate this with the GUID() formula. </w:t>
+        <w:t xml:space="preserve">If this happens Power Apps ID will need to be added manually. Can automate this </w:t>
+      </w:r>
+      <w:r>
+        <w:t xml:space="preserve">with </w:t>
+      </w:r>
+      <w:proofErr w:type="gramStart"/>
+      <w:r>
+        <w:t>GUID(</w:t>
+      </w:r>
+      <w:proofErr w:type="gramEnd"/>
+      <w:r>
+        <w:t>)</w:t>
+      </w:r>
+      <w:r>
+        <w:t xml:space="preserve"> (no </w:t>
+      </w:r>
+      <w:proofErr w:type="gramStart"/>
+      <w:r>
+        <w:t>equals</w:t>
+      </w:r>
+      <w:proofErr w:type="gramEnd"/>
+      <w:r>
+        <w:t xml:space="preserve"> sign!)</w:t>
+      </w:r>
+      <w:r>
+        <w:t xml:space="preserve">. </w:t>
       </w:r>
     </w:p>
     <w:p>
@@ -574,12 +593,6 @@
         <w:gridCol w:w="9747"/>
       </w:tblGrid>
       <w:tr>
-        <w:tblPrEx>
-          <w:tblCellMar>
-            <w:top w:w="0" w:type="dxa"/>
-            <w:bottom w:w="0" w:type="dxa"/>
-          </w:tblCellMar>
-        </w:tblPrEx>
         <w:tc>
           <w:tcPr>
             <w:tcW w:w="300" w:type="dxa"/>
@@ -637,7 +650,7 @@
               </w:rPr>
               <w:t xml:space="preserve">If all else fails: import the Excel table as a SharePoint list and connect from there. Exercise Files include instructions. See </w:t>
             </w:r>
-            <w:hyperlink r:id="rId18" w:history="1">
+            <w:hyperlink r:id="rId8" w:history="1">
               <w:r>
                 <w:rPr>
                   <w:rStyle w:val="Hyperlink"/>
@@ -908,7 +921,16 @@
           <w:sz w:val="19"/>
           <w:szCs w:val="19"/>
         </w:rPr>
-        <w:t>Go to Edit Screen → click the field (e.g., Description)</w:t>
+        <w:t xml:space="preserve">Go to Edit Screen → click </w:t>
+      </w:r>
+      <w:r>
+        <w:rPr>
+          <w:b/>
+          <w:bCs/>
+          <w:sz w:val="19"/>
+          <w:szCs w:val="19"/>
+        </w:rPr>
+        <w:t xml:space="preserve">the Description field (the WHOLE box, not just the text area) </w:t>
       </w:r>
     </w:p>
     <w:p>
@@ -981,6 +1003,57 @@
           <w:szCs w:val="18"/>
         </w:rPr>
         <w:t>An asterisk (*) appears on the canvas confirming the change</w:t>
+      </w:r>
+    </w:p>
+    <w:p>
+      <w:pPr>
+        <w:spacing w:before="60"/>
+      </w:pPr>
+    </w:p>
+    <w:p>
+      <w:pPr>
+        <w:spacing w:before="60"/>
+      </w:pPr>
+      <w:r>
+        <w:rPr>
+          <w:noProof/>
+        </w:rPr>
+        <w:lastRenderedPageBreak/>
+        <w:drawing>
+          <wp:inline distT="0" distB="0" distL="0" distR="0" wp14:anchorId="59C1C6BC" wp14:editId="074B093C">
+            <wp:extent cx="6400800" cy="3361690"/>
+            <wp:effectExtent l="0" t="0" r="0" b="0"/>
+            <wp:docPr id="397039851" name="Picture 1"/>
+            <wp:cNvGraphicFramePr>
+              <a:graphicFrameLocks xmlns:a="http://schemas.openxmlformats.org/drawingml/2006/main" noChangeAspect="1"/>
+            </wp:cNvGraphicFramePr>
+            <a:graphic xmlns:a="http://schemas.openxmlformats.org/drawingml/2006/main">
+              <a:graphicData uri="http://schemas.openxmlformats.org/drawingml/2006/picture">
+                <pic:pic xmlns:pic="http://schemas.openxmlformats.org/drawingml/2006/picture">
+                  <pic:nvPicPr>
+                    <pic:cNvPr id="397039851" name=""/>
+                    <pic:cNvPicPr/>
+                  </pic:nvPicPr>
+                  <pic:blipFill>
+                    <a:blip r:embed="rId9"/>
+                    <a:stretch>
+                      <a:fillRect/>
+                    </a:stretch>
+                  </pic:blipFill>
+                  <pic:spPr>
+                    <a:xfrm>
+                      <a:off x="0" y="0"/>
+                      <a:ext cx="6400800" cy="3361690"/>
+                    </a:xfrm>
+                    <a:prstGeom prst="rect">
+                      <a:avLst/>
+                    </a:prstGeom>
+                  </pic:spPr>
+                </pic:pic>
+              </a:graphicData>
+            </a:graphic>
+          </wp:inline>
+        </w:drawing>
       </w:r>
     </w:p>
     <w:p>
@@ -1010,12 +1083,6 @@
         <w:gridCol w:w="9747"/>
       </w:tblGrid>
       <w:tr>
-        <w:tblPrEx>
-          <w:tblCellMar>
-            <w:top w:w="0" w:type="dxa"/>
-            <w:bottom w:w="0" w:type="dxa"/>
-          </w:tblCellMar>
-        </w:tblPrEx>
         <w:tc>
           <w:tcPr>
             <w:tcW w:w="300" w:type="dxa"/>
@@ -1137,44 +1204,73 @@
           <w:sz w:val="19"/>
           <w:szCs w:val="19"/>
         </w:rPr>
+        <w:t xml:space="preserve">2.  </w:t>
+      </w:r>
+      <w:r>
+        <w:rPr>
+          <w:b/>
+          <w:bCs/>
+          <w:sz w:val="19"/>
+          <w:szCs w:val="19"/>
+        </w:rPr>
+        <w:t>Right panel → Display tab → click Edit next to Field</w:t>
+      </w:r>
+    </w:p>
+    <w:p>
+      <w:pPr>
+        <w:spacing w:before="60"/>
+        <w:rPr>
+          <w:i/>
+          <w:iCs/>
+          <w:sz w:val="19"/>
+          <w:szCs w:val="19"/>
+        </w:rPr>
+      </w:pPr>
+      <w:r>
+        <w:rPr>
+          <w:i/>
+          <w:iCs/>
+          <w:sz w:val="19"/>
+          <w:szCs w:val="19"/>
+        </w:rPr>
+        <w:t>If</w:t>
+      </w:r>
+      <w:r>
+        <w:rPr>
+          <w:i/>
+          <w:iCs/>
+          <w:sz w:val="19"/>
+          <w:szCs w:val="19"/>
+        </w:rPr>
+        <w:t xml:space="preserve"> Power Apps says that no data is found, refresh/reselect the tasks table.  </w:t>
+      </w:r>
+    </w:p>
+    <w:p>
+      <w:pPr>
+        <w:spacing w:before="60"/>
+        <w:rPr>
+          <w:b/>
+          <w:bCs/>
+          <w:sz w:val="19"/>
+          <w:szCs w:val="19"/>
+        </w:rPr>
+      </w:pPr>
+    </w:p>
+    <w:p>
+      <w:pPr>
+        <w:spacing w:before="60"/>
+        <w:rPr>
+          <w:b/>
+          <w:bCs/>
+          <w:sz w:val="19"/>
+          <w:szCs w:val="19"/>
+        </w:rPr>
+      </w:pPr>
+      <w:r>
+        <w:rPr>
+          <w:noProof/>
+        </w:rPr>
         <w:lastRenderedPageBreak/>
-        <w:t xml:space="preserve">2.  </w:t>
-      </w:r>
-      <w:r>
-        <w:rPr>
-          <w:b/>
-          <w:bCs/>
-          <w:sz w:val="19"/>
-          <w:szCs w:val="19"/>
-        </w:rPr>
-        <w:t>Right panel → Display tab → click Edit next to Field</w:t>
-      </w:r>
-    </w:p>
-    <w:p>
-      <w:pPr>
-        <w:spacing w:before="60"/>
-        <w:rPr>
-          <w:b/>
-          <w:bCs/>
-          <w:sz w:val="19"/>
-          <w:szCs w:val="19"/>
-        </w:rPr>
-      </w:pPr>
-    </w:p>
-    <w:p>
-      <w:pPr>
-        <w:spacing w:before="60"/>
-        <w:rPr>
-          <w:b/>
-          <w:bCs/>
-          <w:sz w:val="19"/>
-          <w:szCs w:val="19"/>
-        </w:rPr>
-      </w:pPr>
-      <w:r>
-        <w:rPr>
-          <w:noProof/>
-        </w:rPr>
         <w:drawing>
           <wp:inline distT="0" distB="0" distL="0" distR="0" wp14:anchorId="537B935C" wp14:editId="03E65D16">
             <wp:extent cx="6400800" cy="3797935"/>
@@ -1191,7 +1287,7 @@
                     <pic:cNvPicPr/>
                   </pic:nvPicPr>
                   <pic:blipFill>
-                    <a:blip r:embed="rId8"/>
+                    <a:blip r:embed="rId10"/>
                     <a:stretch>
                       <a:fillRect/>
                     </a:stretch>
@@ -1255,26 +1351,159 @@
     <w:p>
       <w:pPr>
         <w:spacing w:before="60"/>
-      </w:pPr>
-      <w:r>
-        <w:rPr>
-          <w:b/>
-          <w:bCs/>
-          <w:color w:val="CF3338"/>
-          <w:sz w:val="19"/>
-          <w:szCs w:val="19"/>
-        </w:rPr>
-        <w:t xml:space="preserve">4.  </w:t>
-      </w:r>
-      <w:r>
-        <w:rPr>
-          <w:b/>
-          <w:bCs/>
-          <w:sz w:val="19"/>
-          <w:szCs w:val="19"/>
-        </w:rPr>
-        <w:t>Advanced tab → click Unlock</w:t>
-      </w:r>
+        <w:rPr>
+          <w:b/>
+          <w:bCs/>
+          <w:sz w:val="19"/>
+          <w:szCs w:val="19"/>
+        </w:rPr>
+      </w:pPr>
+      <w:r>
+        <w:rPr>
+          <w:b/>
+          <w:bCs/>
+          <w:color w:val="CF3338"/>
+          <w:sz w:val="19"/>
+          <w:szCs w:val="19"/>
+        </w:rPr>
+        <w:t>4</w:t>
+      </w:r>
+      <w:proofErr w:type="gramStart"/>
+      <w:r>
+        <w:rPr>
+          <w:b/>
+          <w:bCs/>
+          <w:color w:val="CF3338"/>
+          <w:sz w:val="19"/>
+          <w:szCs w:val="19"/>
+        </w:rPr>
+        <w:t xml:space="preserve">.  </w:t>
+      </w:r>
+      <w:r>
+        <w:rPr>
+          <w:b/>
+          <w:bCs/>
+          <w:sz w:val="19"/>
+          <w:szCs w:val="19"/>
+        </w:rPr>
+        <w:t>Click</w:t>
+      </w:r>
+      <w:proofErr w:type="gramEnd"/>
+      <w:r>
+        <w:rPr>
+          <w:b/>
+          <w:bCs/>
+          <w:sz w:val="19"/>
+          <w:szCs w:val="19"/>
+        </w:rPr>
+        <w:t xml:space="preserve"> on the Status field (not just text box) </w:t>
+      </w:r>
+    </w:p>
+    <w:p>
+      <w:pPr>
+        <w:spacing w:before="60"/>
+        <w:ind w:firstLine="720"/>
+        <w:rPr>
+          <w:b/>
+          <w:bCs/>
+          <w:sz w:val="19"/>
+          <w:szCs w:val="19"/>
+        </w:rPr>
+      </w:pPr>
+      <w:r>
+        <w:rPr>
+          <w:b/>
+          <w:bCs/>
+          <w:sz w:val="19"/>
+          <w:szCs w:val="19"/>
+        </w:rPr>
+        <w:t>Then A</w:t>
+      </w:r>
+      <w:r>
+        <w:rPr>
+          <w:b/>
+          <w:bCs/>
+          <w:sz w:val="19"/>
+          <w:szCs w:val="19"/>
+        </w:rPr>
+        <w:t>dvanced tab → click Unlock</w:t>
+      </w:r>
+    </w:p>
+    <w:p>
+      <w:pPr>
+        <w:spacing w:before="60"/>
+        <w:ind w:firstLine="720"/>
+        <w:rPr>
+          <w:b/>
+          <w:bCs/>
+          <w:sz w:val="19"/>
+          <w:szCs w:val="19"/>
+        </w:rPr>
+      </w:pPr>
+    </w:p>
+    <w:p>
+      <w:pPr>
+        <w:spacing w:before="60"/>
+        <w:ind w:firstLine="720"/>
+        <w:rPr>
+          <w:b/>
+          <w:bCs/>
+          <w:sz w:val="19"/>
+          <w:szCs w:val="19"/>
+        </w:rPr>
+      </w:pPr>
+      <w:r>
+        <w:rPr>
+          <w:noProof/>
+        </w:rPr>
+        <w:drawing>
+          <wp:inline distT="0" distB="0" distL="0" distR="0" wp14:anchorId="73C88384" wp14:editId="796B0CF5">
+            <wp:extent cx="5514644" cy="2896282"/>
+            <wp:effectExtent l="0" t="0" r="0" b="0"/>
+            <wp:docPr id="721902912" name="Picture 1"/>
+            <wp:cNvGraphicFramePr>
+              <a:graphicFrameLocks xmlns:a="http://schemas.openxmlformats.org/drawingml/2006/main" noChangeAspect="1"/>
+            </wp:cNvGraphicFramePr>
+            <a:graphic xmlns:a="http://schemas.openxmlformats.org/drawingml/2006/main">
+              <a:graphicData uri="http://schemas.openxmlformats.org/drawingml/2006/picture">
+                <pic:pic xmlns:pic="http://schemas.openxmlformats.org/drawingml/2006/picture">
+                  <pic:nvPicPr>
+                    <pic:cNvPr id="721902912" name=""/>
+                    <pic:cNvPicPr/>
+                  </pic:nvPicPr>
+                  <pic:blipFill>
+                    <a:blip r:embed="rId11"/>
+                    <a:stretch>
+                      <a:fillRect/>
+                    </a:stretch>
+                  </pic:blipFill>
+                  <pic:spPr>
+                    <a:xfrm>
+                      <a:off x="0" y="0"/>
+                      <a:ext cx="5519639" cy="2898906"/>
+                    </a:xfrm>
+                    <a:prstGeom prst="rect">
+                      <a:avLst/>
+                    </a:prstGeom>
+                  </pic:spPr>
+                </pic:pic>
+              </a:graphicData>
+            </a:graphic>
+          </wp:inline>
+        </w:drawing>
+      </w:r>
+    </w:p>
+    <w:p>
+      <w:pPr>
+        <w:spacing w:before="60"/>
+        <w:ind w:firstLine="720"/>
+        <w:rPr>
+          <w:b/>
+          <w:bCs/>
+          <w:sz w:val="19"/>
+          <w:szCs w:val="19"/>
+        </w:rPr>
+      </w:pPr>
     </w:p>
     <w:p>
       <w:pPr>
@@ -1356,7 +1585,6 @@
         <w:rPr>
           <w:noProof/>
         </w:rPr>
-        <w:lastRenderedPageBreak/>
         <w:drawing>
           <wp:inline distT="0" distB="0" distL="0" distR="0" wp14:anchorId="50506729" wp14:editId="5FD2B8FB">
             <wp:extent cx="6400800" cy="3797935"/>
@@ -1373,7 +1601,7 @@
                     <pic:cNvPicPr/>
                   </pic:nvPicPr>
                   <pic:blipFill>
-                    <a:blip r:embed="rId9"/>
+                    <a:blip r:embed="rId12"/>
                     <a:stretch>
                       <a:fillRect/>
                     </a:stretch>
@@ -1426,12 +1654,6 @@
         <w:gridCol w:w="9747"/>
       </w:tblGrid>
       <w:tr>
-        <w:tblPrEx>
-          <w:tblCellMar>
-            <w:top w:w="0" w:type="dxa"/>
-            <w:bottom w:w="0" w:type="dxa"/>
-          </w:tblCellMar>
-        </w:tblPrEx>
         <w:tc>
           <w:tcPr>
             <w:tcW w:w="300" w:type="dxa"/>
@@ -1540,39 +1762,45 @@
       <w:pPr>
         <w:spacing w:before="60"/>
       </w:pPr>
-    </w:p>
-    <w:p>
-      <w:pPr>
-        <w:spacing w:before="60"/>
-      </w:pPr>
-    </w:p>
-    <w:p>
-      <w:pPr>
-        <w:spacing w:before="60"/>
-      </w:pPr>
-    </w:p>
-    <w:p>
-      <w:pPr>
-        <w:spacing w:before="60"/>
-      </w:pPr>
-      <w:r>
-        <w:rPr>
-          <w:b/>
-          <w:bCs/>
-          <w:color w:val="CF3338"/>
-          <w:sz w:val="19"/>
-          <w:szCs w:val="19"/>
-        </w:rPr>
-        <w:t xml:space="preserve">2.  </w:t>
-      </w:r>
-      <w:r>
-        <w:rPr>
-          <w:b/>
-          <w:bCs/>
-          <w:sz w:val="19"/>
-          <w:szCs w:val="19"/>
-        </w:rPr>
-        <w:t>Click directly on the date button/field itself</w:t>
+      <w:r>
+        <w:rPr>
+          <w:b/>
+          <w:bCs/>
+          <w:color w:val="CF3338"/>
+          <w:sz w:val="19"/>
+          <w:szCs w:val="19"/>
+        </w:rPr>
+        <w:t>2</w:t>
+      </w:r>
+      <w:proofErr w:type="gramStart"/>
+      <w:r>
+        <w:rPr>
+          <w:b/>
+          <w:bCs/>
+          <w:color w:val="CF3338"/>
+          <w:sz w:val="19"/>
+          <w:szCs w:val="19"/>
+        </w:rPr>
+        <w:t xml:space="preserve">.  </w:t>
+      </w:r>
+      <w:r>
+        <w:rPr>
+          <w:b/>
+          <w:bCs/>
+          <w:sz w:val="19"/>
+          <w:szCs w:val="19"/>
+        </w:rPr>
+        <w:t>Click</w:t>
+      </w:r>
+      <w:proofErr w:type="gramEnd"/>
+      <w:r>
+        <w:rPr>
+          <w:b/>
+          <w:bCs/>
+          <w:sz w:val="19"/>
+          <w:szCs w:val="19"/>
+        </w:rPr>
+        <w:t xml:space="preserve"> directly on the date button/field itself</w:t>
       </w:r>
     </w:p>
     <w:p>
@@ -1681,7 +1909,7 @@
                     <pic:cNvPicPr/>
                   </pic:nvPicPr>
                   <pic:blipFill>
-                    <a:blip r:embed="rId10"/>
+                    <a:blip r:embed="rId13"/>
                     <a:stretch>
                       <a:fillRect/>
                     </a:stretch>
@@ -1729,12 +1957,6 @@
         <w:gridCol w:w="9747"/>
       </w:tblGrid>
       <w:tr>
-        <w:tblPrEx>
-          <w:tblCellMar>
-            <w:top w:w="0" w:type="dxa"/>
-            <w:bottom w:w="0" w:type="dxa"/>
-          </w:tblCellMar>
-        </w:tblPrEx>
         <w:tc>
           <w:tcPr>
             <w:tcW w:w="300" w:type="dxa"/>
@@ -1864,7 +2086,7 @@
                     <pic:cNvPicPr/>
                   </pic:nvPicPr>
                   <pic:blipFill>
-                    <a:blip r:embed="rId11"/>
+                    <a:blip r:embed="rId14"/>
                     <a:stretch>
                       <a:fillRect/>
                     </a:stretch>
@@ -2037,12 +2259,6 @@
         <w:gridCol w:w="9747"/>
       </w:tblGrid>
       <w:tr>
-        <w:tblPrEx>
-          <w:tblCellMar>
-            <w:top w:w="0" w:type="dxa"/>
-            <w:bottom w:w="0" w:type="dxa"/>
-          </w:tblCellMar>
-        </w:tblPrEx>
         <w:tc>
           <w:tcPr>
             <w:tcW w:w="300" w:type="dxa"/>
@@ -2131,12 +2347,6 @@
         <w:gridCol w:w="9747"/>
       </w:tblGrid>
       <w:tr>
-        <w:tblPrEx>
-          <w:tblCellMar>
-            <w:top w:w="0" w:type="dxa"/>
-            <w:bottom w:w="0" w:type="dxa"/>
-          </w:tblCellMar>
-        </w:tblPrEx>
         <w:tc>
           <w:tcPr>
             <w:tcW w:w="300" w:type="dxa"/>
@@ -2409,7 +2619,7 @@
                     <pic:cNvPicPr/>
                   </pic:nvPicPr>
                   <pic:blipFill>
-                    <a:blip r:embed="rId12"/>
+                    <a:blip r:embed="rId15"/>
                     <a:stretch>
                       <a:fillRect/>
                     </a:stretch>
@@ -2545,7 +2755,7 @@
                     <pic:cNvPicPr/>
                   </pic:nvPicPr>
                   <pic:blipFill>
-                    <a:blip r:embed="rId13"/>
+                    <a:blip r:embed="rId16"/>
                     <a:stretch>
                       <a:fillRect/>
                     </a:stretch>
@@ -2593,12 +2803,6 @@
         <w:gridCol w:w="9747"/>
       </w:tblGrid>
       <w:tr>
-        <w:tblPrEx>
-          <w:tblCellMar>
-            <w:top w:w="0" w:type="dxa"/>
-            <w:bottom w:w="0" w:type="dxa"/>
-          </w:tblCellMar>
-        </w:tblPrEx>
         <w:tc>
           <w:tcPr>
             <w:tcW w:w="300" w:type="dxa"/>
@@ -2910,12 +3114,6 @@
         <w:gridCol w:w="9747"/>
       </w:tblGrid>
       <w:tr>
-        <w:tblPrEx>
-          <w:tblCellMar>
-            <w:top w:w="0" w:type="dxa"/>
-            <w:bottom w:w="0" w:type="dxa"/>
-          </w:tblCellMar>
-        </w:tblPrEx>
         <w:tc>
           <w:tcPr>
             <w:tcW w:w="300" w:type="dxa"/>
@@ -2983,8 +3181,8 @@
       </w:pPr>
     </w:p>
     <w:sectPr>
-      <w:headerReference w:type="default" r:id="rId14"/>
-      <w:footerReference w:type="default" r:id="rId15"/>
+      <w:headerReference w:type="default" r:id="rId17"/>
+      <w:footerReference w:type="default" r:id="rId18"/>
       <w:pgSz w:w="12240" w:h="15840"/>
       <w:pgMar w:top="1080" w:right="1080" w:bottom="1080" w:left="1080" w:header="708" w:footer="708" w:gutter="0"/>
       <w:cols w:space="720"/>

</xml_diff>